<commit_message>
feature: added hypotheses feature: better description / ordering feature: bonus tasks
</commit_message>
<xml_diff>
--- a/doc/Auswertung Studie ZELASTO.docx
+++ b/doc/Auswertung Studie ZELASTO.docx
@@ -440,7 +440,15 @@
         </w:numPr>
       </w:pPr>
       <w:r>
-        <w:t>Ersetzen: Pro Task, muss im ersten Trial  TASK_VIEW mit START getauscht werden</w:t>
+        <w:t xml:space="preserve">Ersetzen: Pro Task, muss im ersten </w:t>
+      </w:r>
+      <w:proofErr w:type="gramStart"/>
+      <w:r>
+        <w:t>Trial  TASK</w:t>
+      </w:r>
+      <w:proofErr w:type="gramEnd"/>
+      <w:r>
+        <w:t>_VIEW mit START getauscht werden</w:t>
       </w:r>
     </w:p>
     <w:p>
@@ -452,7 +460,10 @@
         </w:numPr>
       </w:pPr>
       <w:r>
-        <w:t>Header schreiben (für bessere Adressierung ?)</w:t>
+        <w:t>Spalten benennen</w:t>
+      </w:r>
+      <w:r>
+        <w:t xml:space="preserve"> (für bessere Adressierung)</w:t>
       </w:r>
     </w:p>
     <w:p>
@@ -462,16 +473,36 @@
           <w:ilvl w:val="0"/>
           <w:numId w:val="1"/>
         </w:numPr>
-      </w:pPr>
-      <w:r>
+        <w:rPr>
+          <w:color w:val="A5A5A5" w:themeColor="accent3"/>
+        </w:rPr>
+      </w:pPr>
+      <w:r>
+        <w:rPr>
+          <w:color w:val="A5A5A5" w:themeColor="accent3"/>
+        </w:rPr>
         <w:t xml:space="preserve">Nebenbedingung/Bonus: sowohl „nur Studie“ / „nur Test“ / „Test und Studie“ zusammen laden </w:t>
       </w:r>
       <w:r>
+        <w:rPr>
+          <w:color w:val="A5A5A5" w:themeColor="accent3"/>
+        </w:rPr>
         <w:sym w:font="Wingdings" w:char="F0E0"/>
       </w:r>
       <w:r>
-        <w:t xml:space="preserve"> Ordner-Struktur / Namensschema ?</w:t>
-      </w:r>
+        <w:rPr>
+          <w:color w:val="A5A5A5" w:themeColor="accent3"/>
+        </w:rPr>
+        <w:t xml:space="preserve"> Ordner-Struktur / </w:t>
+      </w:r>
+      <w:proofErr w:type="gramStart"/>
+      <w:r>
+        <w:rPr>
+          <w:color w:val="A5A5A5" w:themeColor="accent3"/>
+        </w:rPr>
+        <w:t>Namensschema ?</w:t>
+      </w:r>
+      <w:proofErr w:type="gramEnd"/>
     </w:p>
     <w:p>
       <w:pPr>
@@ -484,6 +515,25 @@
       <w:r>
         <w:t>Lösung/Code dokumentieren</w:t>
       </w:r>
+      <w:r>
+        <w:t xml:space="preserve"> (</w:t>
+      </w:r>
+      <w:proofErr w:type="spellStart"/>
+      <w:r>
+        <w:t>jupyter</w:t>
+      </w:r>
+      <w:proofErr w:type="spellEnd"/>
+      <w:r>
+        <w:t xml:space="preserve"> </w:t>
+      </w:r>
+      <w:proofErr w:type="spellStart"/>
+      <w:r>
+        <w:t>notebook</w:t>
+      </w:r>
+      <w:proofErr w:type="spellEnd"/>
+      <w:r>
+        <w:t>)</w:t>
+      </w:r>
     </w:p>
     <w:p>
       <w:pPr>
@@ -506,8 +556,13 @@
         <w:t>Erfolg/Fehler für jeden Trial</w:t>
       </w:r>
       <w:r>
-        <w:t xml:space="preserve"> und je Proband</w:t>
-      </w:r>
+        <w:t xml:space="preserve"> und </w:t>
+      </w:r>
+      <w:proofErr w:type="gramStart"/>
+      <w:r>
+        <w:t>je Proband</w:t>
+      </w:r>
+      <w:proofErr w:type="gramEnd"/>
     </w:p>
     <w:tbl>
       <w:tblPr>
@@ -888,8 +943,13 @@
         </w:numPr>
       </w:pPr>
       <w:r>
-        <w:t>Versuchsdauer für jeden Trial und je Proband</w:t>
-      </w:r>
+        <w:t xml:space="preserve">Versuchsdauer für jeden Trial und </w:t>
+      </w:r>
+      <w:proofErr w:type="gramStart"/>
+      <w:r>
+        <w:t>je Proband</w:t>
+      </w:r>
+      <w:proofErr w:type="gramEnd"/>
     </w:p>
     <w:tbl>
       <w:tblPr>
@@ -1270,95 +1330,6 @@
         </w:numPr>
       </w:pPr>
       <w:r>
-        <w:t>Plot: über alle Probanden für eine bestimm</w:t>
-      </w:r>
-      <w:r>
-        <w:t>t</w:t>
-      </w:r>
-      <w:r>
-        <w:t>e Kon</w:t>
-      </w:r>
-      <w:r>
-        <w:t>stell</w:t>
-      </w:r>
-      <w:r>
-        <w:t xml:space="preserve">ation aus </w:t>
-      </w:r>
-      <w:proofErr w:type="spellStart"/>
-      <w:r>
-        <w:t>mapping</w:t>
-      </w:r>
-      <w:proofErr w:type="spellEnd"/>
-      <w:r>
-        <w:t xml:space="preserve"> </w:t>
-      </w:r>
-      <w:proofErr w:type="spellStart"/>
-      <w:r>
-        <w:t>method</w:t>
-      </w:r>
-      <w:proofErr w:type="spellEnd"/>
-      <w:r>
-        <w:t xml:space="preserve">, </w:t>
-      </w:r>
-      <w:proofErr w:type="spellStart"/>
-      <w:r>
-        <w:t>E</w:t>
-      </w:r>
-      <w:r>
-        <w:t>benen</w:t>
-      </w:r>
-      <w:r>
-        <w:t>an</w:t>
-      </w:r>
-      <w:r>
-        <w:t>zahl</w:t>
-      </w:r>
-      <w:proofErr w:type="spellEnd"/>
-      <w:r>
-        <w:t>, Zielebene</w:t>
-      </w:r>
-      <w:r>
-        <w:t xml:space="preserve"> </w:t>
-      </w:r>
-    </w:p>
-    <w:p>
-      <w:pPr>
-        <w:pStyle w:val="Listenabsatz"/>
-        <w:numPr>
-          <w:ilvl w:val="1"/>
-          <w:numId w:val="1"/>
-        </w:numPr>
-      </w:pPr>
-      <w:r>
-        <w:t>Y: Ebenen / Tiefe</w:t>
-      </w:r>
-    </w:p>
-    <w:p>
-      <w:pPr>
-        <w:pStyle w:val="Listenabsatz"/>
-        <w:numPr>
-          <w:ilvl w:val="1"/>
-          <w:numId w:val="1"/>
-        </w:numPr>
-      </w:pPr>
-      <w:r>
-        <w:t>X: Zeit</w:t>
-      </w:r>
-    </w:p>
-    <w:p>
-      <w:pPr>
-        <w:pStyle w:val="Listenabsatz"/>
-      </w:pPr>
-    </w:p>
-    <w:p>
-      <w:pPr>
-        <w:pStyle w:val="Listenabsatz"/>
-        <w:numPr>
-          <w:ilvl w:val="0"/>
-          <w:numId w:val="1"/>
-        </w:numPr>
-      </w:pPr>
-      <w:r>
         <w:t xml:space="preserve">Erfolg/Fehlerquote über alle Probanden je </w:t>
       </w:r>
       <w:proofErr w:type="spellStart"/>
@@ -1386,7 +1357,7 @@
     <w:tbl>
       <w:tblPr>
         <w:tblStyle w:val="Listentabelle3Akzent1"/>
-        <w:tblW w:w="0" w:type="auto"/>
+        <w:tblW w:w="9067" w:type="dxa"/>
         <w:tblLook w:val="04A0" w:firstRow="1" w:lastRow="0" w:firstColumn="1" w:lastColumn="0" w:noHBand="0" w:noVBand="1"/>
       </w:tblPr>
       <w:tblGrid>
@@ -1396,7 +1367,7 @@
         <w:gridCol w:w="1292"/>
         <w:gridCol w:w="1353"/>
         <w:gridCol w:w="482"/>
-        <w:gridCol w:w="736"/>
+        <w:gridCol w:w="1432"/>
       </w:tblGrid>
       <w:tr>
         <w:trPr>
@@ -1523,7 +1494,7 @@
         </w:tc>
         <w:tc>
           <w:tcPr>
-            <w:tcW w:w="736" w:type="dxa"/>
+            <w:tcW w:w="1432" w:type="dxa"/>
           </w:tcPr>
           <w:p>
             <w:pPr>
@@ -1695,7 +1666,7 @@
         </w:tc>
         <w:tc>
           <w:tcPr>
-            <w:tcW w:w="736" w:type="dxa"/>
+            <w:tcW w:w="1432" w:type="dxa"/>
           </w:tcPr>
           <w:p>
             <w:pPr>
@@ -1732,7 +1703,7 @@
     <w:tbl>
       <w:tblPr>
         <w:tblStyle w:val="Listentabelle3Akzent1"/>
-        <w:tblW w:w="0" w:type="auto"/>
+        <w:tblW w:w="9067" w:type="dxa"/>
         <w:tblLook w:val="04A0" w:firstRow="1" w:lastRow="0" w:firstColumn="1" w:lastColumn="0" w:noHBand="0" w:noVBand="1"/>
       </w:tblPr>
       <w:tblGrid>
@@ -1742,7 +1713,7 @@
         <w:gridCol w:w="1292"/>
         <w:gridCol w:w="1353"/>
         <w:gridCol w:w="482"/>
-        <w:gridCol w:w="852"/>
+        <w:gridCol w:w="1432"/>
       </w:tblGrid>
       <w:tr>
         <w:trPr>
@@ -1869,7 +1840,7 @@
         </w:tc>
         <w:tc>
           <w:tcPr>
-            <w:tcW w:w="736" w:type="dxa"/>
+            <w:tcW w:w="1432" w:type="dxa"/>
           </w:tcPr>
           <w:p>
             <w:pPr>
@@ -2020,7 +1991,7 @@
         </w:tc>
         <w:tc>
           <w:tcPr>
-            <w:tcW w:w="736" w:type="dxa"/>
+            <w:tcW w:w="1432" w:type="dxa"/>
           </w:tcPr>
           <w:p>
             <w:pPr>
@@ -2051,13 +2022,31 @@
         </w:numPr>
       </w:pPr>
       <w:r>
-        <w:t>Für erfolgreiche Trials: Jeweils z</w:t>
-      </w:r>
-      <w:r>
-        <w:t xml:space="preserve">wischen </w:t>
-      </w:r>
-      <w:r>
-        <w:t xml:space="preserve">HOLD und COMPLETED </w:t>
+        <w:t xml:space="preserve">Plot: über alle Probanden für eine bestimmte Konstellation aus </w:t>
+      </w:r>
+      <w:proofErr w:type="spellStart"/>
+      <w:r>
+        <w:t>mapping</w:t>
+      </w:r>
+      <w:proofErr w:type="spellEnd"/>
+      <w:r>
+        <w:t xml:space="preserve"> </w:t>
+      </w:r>
+      <w:proofErr w:type="spellStart"/>
+      <w:r>
+        <w:t>method</w:t>
+      </w:r>
+      <w:proofErr w:type="spellEnd"/>
+      <w:r>
+        <w:t xml:space="preserve">, </w:t>
+      </w:r>
+      <w:proofErr w:type="spellStart"/>
+      <w:r>
+        <w:t>Ebenenanzahl</w:t>
+      </w:r>
+      <w:proofErr w:type="spellEnd"/>
+      <w:r>
+        <w:t xml:space="preserve">, Zielebene </w:t>
       </w:r>
     </w:p>
     <w:p>
@@ -2069,15 +2058,7 @@
         </w:numPr>
       </w:pPr>
       <w:r>
-        <w:t xml:space="preserve">Maximale Schwankung (% der </w:t>
-      </w:r>
-      <w:proofErr w:type="spellStart"/>
-      <w:r>
-        <w:t>Ebenenbreite</w:t>
-      </w:r>
-      <w:proofErr w:type="spellEnd"/>
-      <w:r>
-        <w:t>)</w:t>
+        <w:t>Y: Ebenen / Tiefe</w:t>
       </w:r>
     </w:p>
     <w:p>
@@ -2089,15 +2070,7 @@
         </w:numPr>
       </w:pPr>
       <w:r>
-        <w:t xml:space="preserve">Durchschnittstiefe (prozentualer Abstand zur </w:t>
-      </w:r>
-      <w:proofErr w:type="spellStart"/>
-      <w:r>
-        <w:t>Ebenenmitte</w:t>
-      </w:r>
-      <w:proofErr w:type="spellEnd"/>
-      <w:r>
-        <w:t xml:space="preserve">) </w:t>
+        <w:t>X: Zeit</w:t>
       </w:r>
     </w:p>
     <w:p>
@@ -2107,9 +2080,246 @@
           <w:ilvl w:val="0"/>
           <w:numId w:val="1"/>
         </w:numPr>
-      </w:pPr>
-      <w:r>
-        <w:t>„Wackler“ vor HOLD (wie oft wurde die Zielebene erreicht, aber nicht gehalten ?)</w:t>
+        <w:rPr>
+          <w:color w:val="A5A5A5" w:themeColor="accent3"/>
+        </w:rPr>
+      </w:pPr>
+      <w:r>
+        <w:rPr>
+          <w:color w:val="A5A5A5" w:themeColor="accent3"/>
+        </w:rPr>
+        <w:t xml:space="preserve">Bonus: Y-Achse nach realen </w:t>
+      </w:r>
+      <w:proofErr w:type="gramStart"/>
+      <w:r>
+        <w:rPr>
+          <w:color w:val="A5A5A5" w:themeColor="accent3"/>
+        </w:rPr>
+        <w:t>Tiefenwerten  skaliert</w:t>
+      </w:r>
+      <w:proofErr w:type="gramEnd"/>
+      <w:r>
+        <w:rPr>
+          <w:color w:val="A5A5A5" w:themeColor="accent3"/>
+        </w:rPr>
+        <w:t xml:space="preserve"> (depthlayers.csv)</w:t>
+      </w:r>
+    </w:p>
+    <w:tbl>
+      <w:tblPr>
+        <w:tblStyle w:val="Listentabelle3Akzent1"/>
+        <w:tblW w:w="9067" w:type="dxa"/>
+        <w:tblLook w:val="04A0" w:firstRow="1" w:lastRow="0" w:firstColumn="1" w:lastColumn="0" w:noHBand="0" w:noVBand="1"/>
+      </w:tblPr>
+      <w:tblGrid>
+        <w:gridCol w:w="1878"/>
+        <w:gridCol w:w="2228"/>
+        <w:gridCol w:w="2835"/>
+        <w:gridCol w:w="2126"/>
+      </w:tblGrid>
+      <w:tr>
+        <w:trPr>
+          <w:cnfStyle w:val="100000000000" w:firstRow="1" w:lastRow="0" w:firstColumn="0" w:lastColumn="0" w:oddVBand="0" w:evenVBand="0" w:oddHBand="0" w:evenHBand="0" w:firstRowFirstColumn="0" w:firstRowLastColumn="0" w:lastRowFirstColumn="0" w:lastRowLastColumn="0"/>
+        </w:trPr>
+        <w:tc>
+          <w:tcPr>
+            <w:cnfStyle w:val="001000000100" w:firstRow="0" w:lastRow="0" w:firstColumn="1" w:lastColumn="0" w:oddVBand="0" w:evenVBand="0" w:oddHBand="0" w:evenHBand="0" w:firstRowFirstColumn="1" w:firstRowLastColumn="0" w:lastRowFirstColumn="0" w:lastRowLastColumn="0"/>
+            <w:tcW w:w="1878" w:type="dxa"/>
+          </w:tcPr>
+          <w:p>
+            <w:pPr>
+              <w:rPr>
+                <w:sz w:val="20"/>
+                <w:szCs w:val="20"/>
+              </w:rPr>
+            </w:pPr>
+            <w:r>
+              <w:rPr>
+                <w:sz w:val="20"/>
+                <w:szCs w:val="20"/>
+              </w:rPr>
+              <w:t>PROBAND</w:t>
+            </w:r>
+          </w:p>
+        </w:tc>
+        <w:tc>
+          <w:tcPr>
+            <w:tcW w:w="2228" w:type="dxa"/>
+          </w:tcPr>
+          <w:p>
+            <w:pPr>
+              <w:cnfStyle w:val="100000000000" w:firstRow="1" w:lastRow="0" w:firstColumn="0" w:lastColumn="0" w:oddVBand="0" w:evenVBand="0" w:oddHBand="0" w:evenHBand="0" w:firstRowFirstColumn="0" w:firstRowLastColumn="0" w:lastRowFirstColumn="0" w:lastRowLastColumn="0"/>
+              <w:rPr>
+                <w:sz w:val="20"/>
+                <w:szCs w:val="20"/>
+              </w:rPr>
+            </w:pPr>
+            <w:r>
+              <w:rPr>
+                <w:sz w:val="20"/>
+                <w:szCs w:val="20"/>
+              </w:rPr>
+              <w:t>TIMESTAMP</w:t>
+            </w:r>
+          </w:p>
+        </w:tc>
+        <w:tc>
+          <w:tcPr>
+            <w:tcW w:w="2835" w:type="dxa"/>
+          </w:tcPr>
+          <w:p>
+            <w:pPr>
+              <w:cnfStyle w:val="100000000000" w:firstRow="1" w:lastRow="0" w:firstColumn="0" w:lastColumn="0" w:oddVBand="0" w:evenVBand="0" w:oddHBand="0" w:evenHBand="0" w:firstRowFirstColumn="0" w:firstRowLastColumn="0" w:lastRowFirstColumn="0" w:lastRowLastColumn="0"/>
+              <w:rPr>
+                <w:sz w:val="20"/>
+                <w:szCs w:val="20"/>
+              </w:rPr>
+            </w:pPr>
+            <w:r>
+              <w:rPr>
+                <w:sz w:val="20"/>
+                <w:szCs w:val="20"/>
+              </w:rPr>
+              <w:t>CURRENT_LAYER</w:t>
+            </w:r>
+          </w:p>
+        </w:tc>
+        <w:tc>
+          <w:tcPr>
+            <w:tcW w:w="2126" w:type="dxa"/>
+          </w:tcPr>
+          <w:p>
+            <w:pPr>
+              <w:cnfStyle w:val="100000000000" w:firstRow="1" w:lastRow="0" w:firstColumn="0" w:lastColumn="0" w:oddVBand="0" w:evenVBand="0" w:oddHBand="0" w:evenHBand="0" w:firstRowFirstColumn="0" w:firstRowLastColumn="0" w:lastRowFirstColumn="0" w:lastRowLastColumn="0"/>
+              <w:rPr>
+                <w:sz w:val="20"/>
+                <w:szCs w:val="20"/>
+              </w:rPr>
+            </w:pPr>
+            <w:r>
+              <w:rPr>
+                <w:sz w:val="20"/>
+                <w:szCs w:val="20"/>
+              </w:rPr>
+              <w:t>Z</w:t>
+            </w:r>
+          </w:p>
+        </w:tc>
+      </w:tr>
+      <w:tr>
+        <w:trPr>
+          <w:cnfStyle w:val="000000100000" w:firstRow="0" w:lastRow="0" w:firstColumn="0" w:lastColumn="0" w:oddVBand="0" w:evenVBand="0" w:oddHBand="1" w:evenHBand="0" w:firstRowFirstColumn="0" w:firstRowLastColumn="0" w:lastRowFirstColumn="0" w:lastRowLastColumn="0"/>
+        </w:trPr>
+        <w:tc>
+          <w:tcPr>
+            <w:cnfStyle w:val="001000000000" w:firstRow="0" w:lastRow="0" w:firstColumn="1" w:lastColumn="0" w:oddVBand="0" w:evenVBand="0" w:oddHBand="0" w:evenHBand="0" w:firstRowFirstColumn="0" w:firstRowLastColumn="0" w:lastRowFirstColumn="0" w:lastRowLastColumn="0"/>
+            <w:tcW w:w="1878" w:type="dxa"/>
+          </w:tcPr>
+          <w:p>
+            <w:pPr>
+              <w:rPr>
+                <w:b w:val="0"/>
+                <w:bCs w:val="0"/>
+                <w:sz w:val="20"/>
+                <w:szCs w:val="20"/>
+              </w:rPr>
+            </w:pPr>
+            <w:r>
+              <w:rPr>
+                <w:b w:val="0"/>
+                <w:bCs w:val="0"/>
+                <w:sz w:val="20"/>
+                <w:szCs w:val="20"/>
+              </w:rPr>
+              <w:t>154</w:t>
+            </w:r>
+          </w:p>
+        </w:tc>
+        <w:tc>
+          <w:tcPr>
+            <w:tcW w:w="2228" w:type="dxa"/>
+          </w:tcPr>
+          <w:p>
+            <w:pPr>
+              <w:cnfStyle w:val="000000100000" w:firstRow="0" w:lastRow="0" w:firstColumn="0" w:lastColumn="0" w:oddVBand="0" w:evenVBand="0" w:oddHBand="1" w:evenHBand="0" w:firstRowFirstColumn="0" w:firstRowLastColumn="0" w:lastRowFirstColumn="0" w:lastRowLastColumn="0"/>
+              <w:rPr>
+                <w:sz w:val="20"/>
+                <w:szCs w:val="20"/>
+              </w:rPr>
+            </w:pPr>
+            <w:r>
+              <w:rPr>
+                <w:sz w:val="20"/>
+                <w:szCs w:val="20"/>
+              </w:rPr>
+              <w:t>12345678</w:t>
+            </w:r>
+          </w:p>
+        </w:tc>
+        <w:tc>
+          <w:tcPr>
+            <w:tcW w:w="2835" w:type="dxa"/>
+          </w:tcPr>
+          <w:p>
+            <w:pPr>
+              <w:cnfStyle w:val="000000100000" w:firstRow="0" w:lastRow="0" w:firstColumn="0" w:lastColumn="0" w:oddVBand="0" w:evenVBand="0" w:oddHBand="1" w:evenHBand="0" w:firstRowFirstColumn="0" w:firstRowLastColumn="0" w:lastRowFirstColumn="0" w:lastRowLastColumn="0"/>
+              <w:rPr>
+                <w:sz w:val="20"/>
+                <w:szCs w:val="20"/>
+              </w:rPr>
+            </w:pPr>
+            <w:r>
+              <w:rPr>
+                <w:sz w:val="20"/>
+                <w:szCs w:val="20"/>
+              </w:rPr>
+              <w:t>6</w:t>
+            </w:r>
+          </w:p>
+        </w:tc>
+        <w:tc>
+          <w:tcPr>
+            <w:tcW w:w="2126" w:type="dxa"/>
+          </w:tcPr>
+          <w:p>
+            <w:pPr>
+              <w:cnfStyle w:val="000000100000" w:firstRow="0" w:lastRow="0" w:firstColumn="0" w:lastColumn="0" w:oddVBand="0" w:evenVBand="0" w:oddHBand="1" w:evenHBand="0" w:firstRowFirstColumn="0" w:firstRowLastColumn="0" w:lastRowFirstColumn="0" w:lastRowLastColumn="0"/>
+              <w:rPr>
+                <w:sz w:val="20"/>
+                <w:szCs w:val="20"/>
+              </w:rPr>
+            </w:pPr>
+            <w:r>
+              <w:rPr>
+                <w:sz w:val="20"/>
+                <w:szCs w:val="20"/>
+              </w:rPr>
+              <w:t>-0.5454545</w:t>
+            </w:r>
+          </w:p>
+        </w:tc>
+      </w:tr>
+    </w:tbl>
+    <w:p>
+      <w:pPr>
+        <w:rPr>
+          <w:rFonts w:asciiTheme="majorHAnsi" w:eastAsiaTheme="majorEastAsia" w:hAnsiTheme="majorHAnsi" w:cstheme="majorBidi"/>
+          <w:color w:val="2F5496" w:themeColor="accent1" w:themeShade="BF"/>
+          <w:sz w:val="26"/>
+          <w:szCs w:val="26"/>
+        </w:rPr>
+      </w:pPr>
+      <w:r>
+        <w:br w:type="page"/>
+      </w:r>
+    </w:p>
+    <w:p>
+      <w:pPr>
+        <w:pStyle w:val="berschrift2"/>
+      </w:pPr>
+      <w:r>
+        <w:lastRenderedPageBreak/>
+        <w:t>Bonus</w:t>
       </w:r>
     </w:p>
     <w:p>
@@ -2121,39 +2331,21 @@
         </w:numPr>
       </w:pPr>
       <w:r>
-        <w:t xml:space="preserve">Dies jeweils nach </w:t>
-      </w:r>
-      <w:proofErr w:type="spellStart"/>
-      <w:r>
-        <w:t>Ebenenanzahl</w:t>
-      </w:r>
-      <w:proofErr w:type="spellEnd"/>
-      <w:r>
-        <w:t xml:space="preserve"> und </w:t>
-      </w:r>
-      <w:proofErr w:type="spellStart"/>
-      <w:r>
-        <w:t>mapping</w:t>
-      </w:r>
-      <w:proofErr w:type="spellEnd"/>
-      <w:r>
-        <w:t xml:space="preserve"> </w:t>
-      </w:r>
-      <w:proofErr w:type="spellStart"/>
-      <w:r>
-        <w:t>methode</w:t>
-      </w:r>
-      <w:proofErr w:type="spellEnd"/>
-      <w:r>
-        <w:t xml:space="preserve"> gruppiert (über alle Probanden)</w:t>
-      </w:r>
-    </w:p>
-    <w:p>
-      <w:pPr>
-        <w:pStyle w:val="berschrift2"/>
-      </w:pPr>
-      <w:r>
-        <w:t>Korrelationen</w:t>
+        <w:t>depthlayers.csv: Mapping der Tiefenwerte auf die zugehörige Ebene nach Mapping-Methode</w:t>
+      </w:r>
+    </w:p>
+    <w:p>
+      <w:pPr>
+        <w:ind w:left="720"/>
+      </w:pPr>
+      <w:r>
+        <w:rPr>
+          <w:b/>
+        </w:rPr>
+        <w:t>Achtung</w:t>
+      </w:r>
+      <w:r>
+        <w:t>: Z-Werte in Studie sind im Bereich [–1,0] zu bewerten, depthlayers.csv gibt die absolut-Werte an!</w:t>
       </w:r>
     </w:p>
     <w:p>
@@ -2165,8 +2357,105 @@
         </w:numPr>
       </w:pPr>
       <w:r>
-        <w:t>Versuchsdauer / Erfolgsquote</w:t>
-      </w:r>
+        <w:t xml:space="preserve">Für </w:t>
+      </w:r>
+      <w:r>
+        <w:rPr>
+          <w:b/>
+          <w:i/>
+        </w:rPr>
+        <w:t>erfolgreiche</w:t>
+      </w:r>
+      <w:r>
+        <w:t xml:space="preserve"> Trials: Jeweils z</w:t>
+      </w:r>
+      <w:r>
+        <w:t xml:space="preserve">wischen </w:t>
+      </w:r>
+      <w:r>
+        <w:rPr>
+          <w:b/>
+        </w:rPr>
+        <w:t>HOLD</w:t>
+      </w:r>
+      <w:r>
+        <w:t xml:space="preserve"> und </w:t>
+      </w:r>
+      <w:r>
+        <w:rPr>
+          <w:b/>
+        </w:rPr>
+        <w:t>COMPLETED</w:t>
+      </w:r>
+      <w:r>
+        <w:t xml:space="preserve"> </w:t>
+      </w:r>
+    </w:p>
+    <w:p>
+      <w:pPr>
+        <w:pStyle w:val="Listenabsatz"/>
+        <w:numPr>
+          <w:ilvl w:val="1"/>
+          <w:numId w:val="1"/>
+        </w:numPr>
+      </w:pPr>
+      <w:r>
+        <w:t xml:space="preserve">Maximale Schwankung (% der </w:t>
+      </w:r>
+      <w:proofErr w:type="spellStart"/>
+      <w:r>
+        <w:t>Ebenenbreite</w:t>
+      </w:r>
+      <w:proofErr w:type="spellEnd"/>
+      <w:r>
+        <w:t>)</w:t>
+      </w:r>
+    </w:p>
+    <w:p>
+      <w:pPr>
+        <w:pStyle w:val="Listenabsatz"/>
+        <w:numPr>
+          <w:ilvl w:val="1"/>
+          <w:numId w:val="1"/>
+        </w:numPr>
+      </w:pPr>
+      <w:r>
+        <w:t xml:space="preserve">Durchschnittstiefe (prozentualer Abstand zur </w:t>
+      </w:r>
+      <w:proofErr w:type="spellStart"/>
+      <w:r>
+        <w:t>Ebenenmitte</w:t>
+      </w:r>
+      <w:proofErr w:type="spellEnd"/>
+      <w:r>
+        <w:t xml:space="preserve">) </w:t>
+      </w:r>
+    </w:p>
+    <w:p>
+      <w:pPr>
+        <w:pStyle w:val="Listenabsatz"/>
+        <w:numPr>
+          <w:ilvl w:val="0"/>
+          <w:numId w:val="2"/>
+        </w:numPr>
+        <w:rPr>
+          <w:i/>
+        </w:rPr>
+      </w:pPr>
+      <w:r>
+        <w:rPr>
+          <w:i/>
+        </w:rPr>
+        <w:t xml:space="preserve">Wie „weit“ waren die Probanden von einem Fehlschlag entfernt / wie sicher haben Sie die ebene </w:t>
+      </w:r>
+      <w:proofErr w:type="gramStart"/>
+      <w:r>
+        <w:rPr>
+          <w:i/>
+        </w:rPr>
+        <w:t>gehalten ?</w:t>
+      </w:r>
+      <w:proofErr w:type="gramEnd"/>
     </w:p>
     <w:p>
       <w:pPr>
@@ -2176,13 +2465,16 @@
           <w:numId w:val="1"/>
         </w:numPr>
       </w:pPr>
-      <w:proofErr w:type="spellStart"/>
-      <w:r>
-        <w:t>Ebenenanzahl</w:t>
-      </w:r>
-      <w:proofErr w:type="spellEnd"/>
-      <w:r>
-        <w:t xml:space="preserve"> / Erfolgsquote</w:t>
+      <w:r>
+        <w:t xml:space="preserve">„Wackler“ vor HOLD (wie oft wurde die Zielebene erreicht, aber nicht </w:t>
+      </w:r>
+      <w:proofErr w:type="gramStart"/>
+      <w:r>
+        <w:t>gehalten ?</w:t>
+      </w:r>
+      <w:proofErr w:type="gramEnd"/>
+      <w:r>
+        <w:t>)</w:t>
       </w:r>
     </w:p>
     <w:p>
@@ -2192,6 +2484,358 @@
           <w:ilvl w:val="0"/>
           <w:numId w:val="1"/>
         </w:numPr>
+      </w:pPr>
+      <w:r>
+        <w:t xml:space="preserve">Dies jeweils nach </w:t>
+      </w:r>
+      <w:proofErr w:type="spellStart"/>
+      <w:r>
+        <w:t>Ebenenanzahl</w:t>
+      </w:r>
+      <w:proofErr w:type="spellEnd"/>
+      <w:r>
+        <w:t xml:space="preserve"> und </w:t>
+      </w:r>
+      <w:proofErr w:type="spellStart"/>
+      <w:r>
+        <w:rPr>
+          <w:b/>
+        </w:rPr>
+        <w:t>M</w:t>
+      </w:r>
+      <w:r>
+        <w:rPr>
+          <w:b/>
+        </w:rPr>
+        <w:t>apping</w:t>
+      </w:r>
+      <w:r>
+        <w:rPr>
+          <w:b/>
+        </w:rPr>
+        <w:t>_M</w:t>
+      </w:r>
+      <w:r>
+        <w:rPr>
+          <w:b/>
+        </w:rPr>
+        <w:t>ethod</w:t>
+      </w:r>
+      <w:proofErr w:type="spellEnd"/>
+      <w:r>
+        <w:t xml:space="preserve"> gruppiert (über alle Probanden)</w:t>
+      </w:r>
+    </w:p>
+    <w:p>
+      <w:pPr>
+        <w:pStyle w:val="Listenabsatz"/>
+        <w:numPr>
+          <w:ilvl w:val="0"/>
+          <w:numId w:val="1"/>
+        </w:numPr>
+      </w:pPr>
+      <w:r>
+        <w:t>Statistische Auswertung – Vorschläge?</w:t>
+      </w:r>
+    </w:p>
+    <w:p>
+      <w:pPr>
+        <w:pStyle w:val="Listenabsatz"/>
+        <w:numPr>
+          <w:ilvl w:val="0"/>
+          <w:numId w:val="1"/>
+        </w:numPr>
+      </w:pPr>
+      <w:r>
+        <w:t>Hypothesen:</w:t>
+      </w:r>
+    </w:p>
+    <w:p>
+      <w:pPr>
+        <w:pStyle w:val="Listenabsatz"/>
+        <w:numPr>
+          <w:ilvl w:val="1"/>
+          <w:numId w:val="1"/>
+        </w:numPr>
+      </w:pPr>
+      <w:r>
+        <w:rPr>
+          <w:i/>
+        </w:rPr>
+        <w:t>Sweet Spot für Anzahl der Ebenen</w:t>
+      </w:r>
+      <w:r>
+        <w:t xml:space="preserve"> (</w:t>
+      </w:r>
+      <w:proofErr w:type="spellStart"/>
+      <w:r>
+        <w:t>bspw</w:t>
+      </w:r>
+      <w:proofErr w:type="spellEnd"/>
+      <w:r>
+        <w:t xml:space="preserve">: ab wann nimmt die Fehlerquote plötzlich stark </w:t>
+      </w:r>
+      <w:proofErr w:type="gramStart"/>
+      <w:r>
+        <w:t>zu ?</w:t>
+      </w:r>
+      <w:proofErr w:type="gramEnd"/>
+      <w:r>
+        <w:t xml:space="preserve"> Oder: bei welcher </w:t>
+      </w:r>
+      <w:proofErr w:type="spellStart"/>
+      <w:r>
+        <w:t>Ebenenanzahl</w:t>
+      </w:r>
+      <w:proofErr w:type="spellEnd"/>
+      <w:r>
+        <w:t xml:space="preserve"> wird eine Genauigkeit &gt; 95% im Schnitt </w:t>
+      </w:r>
+      <w:proofErr w:type="gramStart"/>
+      <w:r>
+        <w:t>erzielt ?</w:t>
+      </w:r>
+      <w:proofErr w:type="gramEnd"/>
+      <w:r>
+        <w:t>)</w:t>
+      </w:r>
+    </w:p>
+    <w:p>
+      <w:pPr>
+        <w:pStyle w:val="Listenabsatz"/>
+        <w:numPr>
+          <w:ilvl w:val="1"/>
+          <w:numId w:val="1"/>
+        </w:numPr>
+      </w:pPr>
+      <w:r>
+        <w:t xml:space="preserve">Vergleich der </w:t>
+      </w:r>
+      <w:proofErr w:type="spellStart"/>
+      <w:r>
+        <w:rPr>
+          <w:b/>
+        </w:rPr>
+        <w:t>Mapping_Method</w:t>
+      </w:r>
+      <w:proofErr w:type="spellEnd"/>
+      <w:r>
+        <w:t xml:space="preserve">: </w:t>
+      </w:r>
+    </w:p>
+    <w:p>
+      <w:pPr>
+        <w:pStyle w:val="Listenabsatz"/>
+        <w:numPr>
+          <w:ilvl w:val="2"/>
+          <w:numId w:val="1"/>
+        </w:numPr>
+      </w:pPr>
+      <w:r>
+        <w:t xml:space="preserve">H1: </w:t>
+      </w:r>
+      <w:proofErr w:type="spellStart"/>
+      <w:r>
+        <w:rPr>
+          <w:i/>
+        </w:rPr>
+        <w:t>widening</w:t>
+      </w:r>
+      <w:proofErr w:type="spellEnd"/>
+      <w:r>
+        <w:rPr>
+          <w:i/>
+        </w:rPr>
+        <w:t xml:space="preserve"> ist genauer als </w:t>
+      </w:r>
+      <w:proofErr w:type="spellStart"/>
+      <w:r>
+        <w:rPr>
+          <w:i/>
+        </w:rPr>
+        <w:t>direct</w:t>
+      </w:r>
+      <w:proofErr w:type="spellEnd"/>
+      <w:r>
+        <w:rPr>
+          <w:i/>
+        </w:rPr>
+        <w:t xml:space="preserve"> und </w:t>
+      </w:r>
+      <w:proofErr w:type="spellStart"/>
+      <w:r>
+        <w:rPr>
+          <w:i/>
+        </w:rPr>
+        <w:t>densening</w:t>
+      </w:r>
+      <w:proofErr w:type="spellEnd"/>
+      <w:r>
+        <w:br/>
+      </w:r>
+      <w:r>
+        <w:t xml:space="preserve">mit zunehmender Tiefe nimmt die benötigte Kraft zu </w:t>
+      </w:r>
+      <w:r>
+        <w:sym w:font="Wingdings" w:char="F0E0"/>
+      </w:r>
+      <w:r>
+        <w:t xml:space="preserve"> Genauigkeit sinkt, deswegen sind die „unteren“ (aka höheren) Ebenen </w:t>
+      </w:r>
+      <w:r>
+        <w:t>weiter auseinander</w:t>
+      </w:r>
+    </w:p>
+    <w:p>
+      <w:pPr>
+        <w:pStyle w:val="Listenabsatz"/>
+        <w:numPr>
+          <w:ilvl w:val="2"/>
+          <w:numId w:val="1"/>
+        </w:numPr>
+      </w:pPr>
+      <w:r>
+        <w:t xml:space="preserve">H2: </w:t>
+      </w:r>
+      <w:proofErr w:type="spellStart"/>
+      <w:r>
+        <w:rPr>
+          <w:i/>
+        </w:rPr>
+        <w:t>densening</w:t>
+      </w:r>
+      <w:proofErr w:type="spellEnd"/>
+      <w:r>
+        <w:rPr>
+          <w:i/>
+        </w:rPr>
+        <w:t xml:space="preserve"> ist genauer als </w:t>
+      </w:r>
+      <w:proofErr w:type="spellStart"/>
+      <w:r>
+        <w:rPr>
+          <w:i/>
+        </w:rPr>
+        <w:t>direct</w:t>
+      </w:r>
+      <w:proofErr w:type="spellEnd"/>
+      <w:r>
+        <w:rPr>
+          <w:i/>
+        </w:rPr>
+        <w:t xml:space="preserve"> und </w:t>
+      </w:r>
+      <w:proofErr w:type="spellStart"/>
+      <w:r>
+        <w:rPr>
+          <w:i/>
+        </w:rPr>
+        <w:t>widening</w:t>
+      </w:r>
+      <w:proofErr w:type="spellEnd"/>
+      <w:r>
+        <w:br/>
+      </w:r>
+      <w:r>
+        <w:t>mit zunehmender Tiefe nimmt die benötigte Kraft zu</w:t>
+      </w:r>
+      <w:r>
+        <w:t xml:space="preserve"> </w:t>
+      </w:r>
+      <w:r>
+        <w:sym w:font="Wingdings" w:char="F0E0"/>
+      </w:r>
+      <w:r>
+        <w:t xml:space="preserve"> konstante Kraftnutzung für den </w:t>
+      </w:r>
+      <w:proofErr w:type="spellStart"/>
+      <w:r>
+        <w:t>Ebenenwechsel</w:t>
+      </w:r>
+      <w:proofErr w:type="spellEnd"/>
+      <w:r>
+        <w:t xml:space="preserve"> = </w:t>
+      </w:r>
+      <w:r>
+        <w:t xml:space="preserve">„untere“ (aka höhere) Ebenen </w:t>
+      </w:r>
+      <w:r>
+        <w:t>näher</w:t>
+      </w:r>
+      <w:r>
+        <w:t xml:space="preserve"> </w:t>
+      </w:r>
+      <w:r>
+        <w:t>bei</w:t>
+      </w:r>
+      <w:r>
+        <w:t>einander</w:t>
+      </w:r>
+    </w:p>
+    <w:p>
+      <w:pPr>
+        <w:pStyle w:val="Listenabsatz"/>
+        <w:numPr>
+          <w:ilvl w:val="2"/>
+          <w:numId w:val="1"/>
+        </w:numPr>
+        <w:rPr>
+          <w:i/>
+        </w:rPr>
+      </w:pPr>
+      <w:r>
+        <w:t xml:space="preserve">H3: </w:t>
+      </w:r>
+      <w:proofErr w:type="spellStart"/>
+      <w:r>
+        <w:rPr>
+          <w:i/>
+        </w:rPr>
+        <w:t>direct</w:t>
+      </w:r>
+      <w:proofErr w:type="spellEnd"/>
+      <w:r>
+        <w:rPr>
+          <w:i/>
+        </w:rPr>
+        <w:t xml:space="preserve"> ist genauer als </w:t>
+      </w:r>
+      <w:proofErr w:type="spellStart"/>
+      <w:r>
+        <w:rPr>
+          <w:i/>
+        </w:rPr>
+        <w:t>widening</w:t>
+      </w:r>
+      <w:proofErr w:type="spellEnd"/>
+      <w:r>
+        <w:rPr>
+          <w:i/>
+        </w:rPr>
+        <w:t xml:space="preserve"> und </w:t>
+      </w:r>
+      <w:proofErr w:type="spellStart"/>
+      <w:r>
+        <w:rPr>
+          <w:i/>
+        </w:rPr>
+        <w:t>densening</w:t>
+      </w:r>
+      <w:proofErr w:type="spellEnd"/>
+    </w:p>
+    <w:p>
+      <w:pPr>
+        <w:pStyle w:val="Listenabsatz"/>
+        <w:ind w:left="2160"/>
+      </w:pPr>
+      <w:r>
+        <w:t>Kraft spielt keine (oder nur geringfügige) Rolle, wichtig ist die äquidistante Positionierung der Tiefenebenen</w:t>
+      </w:r>
+    </w:p>
+    <w:p>
+      <w:pPr>
+        <w:pStyle w:val="Listenabsatz"/>
+        <w:ind w:left="2160"/>
       </w:pPr>
     </w:p>
     <w:p/>
@@ -2208,39 +2852,40 @@
 <file path=word/numbering.xml><?xml version="1.0" encoding="utf-8"?>
 <w:numbering xmlns:wpc="http://schemas.microsoft.com/office/word/2010/wordprocessingCanvas" xmlns:cx="http://schemas.microsoft.com/office/drawing/2014/chartex" xmlns:cx1="http://schemas.microsoft.com/office/drawing/2015/9/8/chartex" xmlns:cx2="http://schemas.microsoft.com/office/drawing/2015/10/21/chartex" xmlns:cx3="http://schemas.microsoft.com/office/drawing/2016/5/9/chartex" xmlns:cx4="http://schemas.microsoft.com/office/drawing/2016/5/10/chartex" xmlns:cx5="http://schemas.microsoft.com/office/drawing/2016/5/11/chartex" xmlns:cx6="http://schemas.microsoft.com/office/drawing/2016/5/12/chartex" xmlns:cx7="http://schemas.microsoft.com/office/drawing/2016/5/13/chartex" xmlns:cx8="http://schemas.microsoft.com/office/drawing/2016/5/14/chartex" xmlns:mc="http://schemas.openxmlformats.org/markup-compatibility/2006" xmlns:aink="http://schemas.microsoft.com/office/drawing/2016/ink" xmlns:am3d="http://schemas.microsoft.com/office/drawing/2017/model3d" xmlns:o="urn:schemas-microsoft-com:office:office" xmlns:r="http://schemas.openxmlformats.org/officeDocument/2006/relationships" xmlns:m="http://schemas.openxmlformats.org/officeDocument/2006/math" xmlns:v="urn:schemas-microsoft-com:vml" xmlns:wp14="http://schemas.microsoft.com/office/word/2010/wordprocessingDrawing" xmlns:wp="http://schemas.openxmlformats.org/drawingml/2006/wordprocessingDrawing" xmlns:w10="urn:schemas-microsoft-com:office:word" xmlns:w="http://schemas.openxmlformats.org/wordprocessingml/2006/main" xmlns:w14="http://schemas.microsoft.com/office/word/2010/wordml" xmlns:w15="http://schemas.microsoft.com/office/word/2012/wordml" xmlns:w16cex="http://schemas.microsoft.com/office/word/2018/wordml/cex" xmlns:w16cid="http://schemas.microsoft.com/office/word/2016/wordml/cid" xmlns:w16="http://schemas.microsoft.com/office/word/2018/wordml" xmlns:w16sdtdh="http://schemas.microsoft.com/office/word/2020/wordml/sdtdatahash" xmlns:w16se="http://schemas.microsoft.com/office/word/2015/wordml/symex" xmlns:wpg="http://schemas.microsoft.com/office/word/2010/wordprocessingGroup" xmlns:wpi="http://schemas.microsoft.com/office/word/2010/wordprocessingInk" xmlns:wne="http://schemas.microsoft.com/office/word/2006/wordml" xmlns:wps="http://schemas.microsoft.com/office/word/2010/wordprocessingShape" mc:Ignorable="w14 w15 w16se w16cid w16 w16cex w16sdtdh wp14">
   <w:abstractNum w:abstractNumId="0" w15:restartNumberingAfterBreak="0">
-    <w:nsid w:val="780D5E29"/>
+    <w:nsid w:val="75DC4D20"/>
     <w:multiLevelType w:val="hybridMultilevel"/>
-    <w:tmpl w:val="3F389B38"/>
-    <w:lvl w:ilvl="0" w:tplc="C130C3C6">
+    <w:tmpl w:val="D17AC7F6"/>
+    <w:lvl w:ilvl="0" w:tplc="5FF809BC">
+      <w:start w:val="1"/>
       <w:numFmt w:val="bullet"/>
-      <w:lvlText w:val="-"/>
+      <w:lvlText w:val=""/>
       <w:lvlJc w:val="left"/>
       <w:pPr>
-        <w:ind w:left="720" w:hanging="360"/>
+        <w:ind w:left="1080" w:hanging="360"/>
       </w:pPr>
       <w:rPr>
-        <w:rFonts w:ascii="Calibri" w:eastAsiaTheme="minorHAnsi" w:hAnsi="Calibri" w:cs="Calibri" w:hint="default"/>
+        <w:rFonts w:ascii="Wingdings" w:eastAsiaTheme="minorHAnsi" w:hAnsi="Wingdings" w:cstheme="minorBidi" w:hint="default"/>
       </w:rPr>
     </w:lvl>
-    <w:lvl w:ilvl="1" w:tplc="04070003">
+    <w:lvl w:ilvl="1" w:tplc="04070003" w:tentative="1">
       <w:start w:val="1"/>
       <w:numFmt w:val="bullet"/>
       <w:lvlText w:val="o"/>
       <w:lvlJc w:val="left"/>
       <w:pPr>
-        <w:ind w:left="1440" w:hanging="360"/>
+        <w:ind w:left="1800" w:hanging="360"/>
       </w:pPr>
       <w:rPr>
         <w:rFonts w:ascii="Courier New" w:hAnsi="Courier New" w:cs="Courier New" w:hint="default"/>
       </w:rPr>
     </w:lvl>
-    <w:lvl w:ilvl="2" w:tplc="04070005">
+    <w:lvl w:ilvl="2" w:tplc="04070005" w:tentative="1">
       <w:start w:val="1"/>
       <w:numFmt w:val="bullet"/>
       <w:lvlText w:val=""/>
       <w:lvlJc w:val="left"/>
       <w:pPr>
-        <w:ind w:left="2160" w:hanging="360"/>
+        <w:ind w:left="2520" w:hanging="360"/>
       </w:pPr>
       <w:rPr>
         <w:rFonts w:ascii="Wingdings" w:hAnsi="Wingdings" w:hint="default"/>
@@ -2252,7 +2897,7 @@
       <w:lvlText w:val=""/>
       <w:lvlJc w:val="left"/>
       <w:pPr>
-        <w:ind w:left="2880" w:hanging="360"/>
+        <w:ind w:left="3240" w:hanging="360"/>
       </w:pPr>
       <w:rPr>
         <w:rFonts w:ascii="Symbol" w:hAnsi="Symbol" w:hint="default"/>
@@ -2264,7 +2909,7 @@
       <w:lvlText w:val="o"/>
       <w:lvlJc w:val="left"/>
       <w:pPr>
-        <w:ind w:left="3600" w:hanging="360"/>
+        <w:ind w:left="3960" w:hanging="360"/>
       </w:pPr>
       <w:rPr>
         <w:rFonts w:ascii="Courier New" w:hAnsi="Courier New" w:cs="Courier New" w:hint="default"/>
@@ -2276,7 +2921,7 @@
       <w:lvlText w:val=""/>
       <w:lvlJc w:val="left"/>
       <w:pPr>
-        <w:ind w:left="4320" w:hanging="360"/>
+        <w:ind w:left="4680" w:hanging="360"/>
       </w:pPr>
       <w:rPr>
         <w:rFonts w:ascii="Wingdings" w:hAnsi="Wingdings" w:hint="default"/>
@@ -2288,7 +2933,7 @@
       <w:lvlText w:val=""/>
       <w:lvlJc w:val="left"/>
       <w:pPr>
-        <w:ind w:left="5040" w:hanging="360"/>
+        <w:ind w:left="5400" w:hanging="360"/>
       </w:pPr>
       <w:rPr>
         <w:rFonts w:ascii="Symbol" w:hAnsi="Symbol" w:hint="default"/>
@@ -2300,7 +2945,7 @@
       <w:lvlText w:val="o"/>
       <w:lvlJc w:val="left"/>
       <w:pPr>
-        <w:ind w:left="5760" w:hanging="360"/>
+        <w:ind w:left="6120" w:hanging="360"/>
       </w:pPr>
       <w:rPr>
         <w:rFonts w:ascii="Courier New" w:hAnsi="Courier New" w:cs="Courier New" w:hint="default"/>
@@ -2312,6 +2957,118 @@
       <w:lvlText w:val=""/>
       <w:lvlJc w:val="left"/>
       <w:pPr>
+        <w:ind w:left="6840" w:hanging="360"/>
+      </w:pPr>
+      <w:rPr>
+        <w:rFonts w:ascii="Wingdings" w:hAnsi="Wingdings" w:hint="default"/>
+      </w:rPr>
+    </w:lvl>
+  </w:abstractNum>
+  <w:abstractNum w:abstractNumId="1" w15:restartNumberingAfterBreak="0">
+    <w:nsid w:val="780D5E29"/>
+    <w:multiLevelType w:val="hybridMultilevel"/>
+    <w:tmpl w:val="ED24FE08"/>
+    <w:lvl w:ilvl="0" w:tplc="C130C3C6">
+      <w:numFmt w:val="bullet"/>
+      <w:lvlText w:val="-"/>
+      <w:lvlJc w:val="left"/>
+      <w:pPr>
+        <w:ind w:left="720" w:hanging="360"/>
+      </w:pPr>
+      <w:rPr>
+        <w:rFonts w:ascii="Calibri" w:eastAsiaTheme="minorHAnsi" w:hAnsi="Calibri" w:cs="Calibri" w:hint="default"/>
+      </w:rPr>
+    </w:lvl>
+    <w:lvl w:ilvl="1" w:tplc="3BDE0EFE">
+      <w:start w:val="1"/>
+      <w:numFmt w:val="decimal"/>
+      <w:lvlText w:val="%2."/>
+      <w:lvlJc w:val="left"/>
+      <w:pPr>
+        <w:ind w:left="1440" w:hanging="360"/>
+      </w:pPr>
+      <w:rPr>
+        <w:rFonts w:asciiTheme="minorHAnsi" w:eastAsiaTheme="minorHAnsi" w:hAnsiTheme="minorHAnsi" w:cstheme="minorBidi"/>
+      </w:rPr>
+    </w:lvl>
+    <w:lvl w:ilvl="2" w:tplc="04070005">
+      <w:start w:val="1"/>
+      <w:numFmt w:val="bullet"/>
+      <w:lvlText w:val=""/>
+      <w:lvlJc w:val="left"/>
+      <w:pPr>
+        <w:ind w:left="2160" w:hanging="360"/>
+      </w:pPr>
+      <w:rPr>
+        <w:rFonts w:ascii="Wingdings" w:hAnsi="Wingdings" w:hint="default"/>
+      </w:rPr>
+    </w:lvl>
+    <w:lvl w:ilvl="3" w:tplc="04070001" w:tentative="1">
+      <w:start w:val="1"/>
+      <w:numFmt w:val="bullet"/>
+      <w:lvlText w:val=""/>
+      <w:lvlJc w:val="left"/>
+      <w:pPr>
+        <w:ind w:left="2880" w:hanging="360"/>
+      </w:pPr>
+      <w:rPr>
+        <w:rFonts w:ascii="Symbol" w:hAnsi="Symbol" w:hint="default"/>
+      </w:rPr>
+    </w:lvl>
+    <w:lvl w:ilvl="4" w:tplc="04070003" w:tentative="1">
+      <w:start w:val="1"/>
+      <w:numFmt w:val="bullet"/>
+      <w:lvlText w:val="o"/>
+      <w:lvlJc w:val="left"/>
+      <w:pPr>
+        <w:ind w:left="3600" w:hanging="360"/>
+      </w:pPr>
+      <w:rPr>
+        <w:rFonts w:ascii="Courier New" w:hAnsi="Courier New" w:cs="Courier New" w:hint="default"/>
+      </w:rPr>
+    </w:lvl>
+    <w:lvl w:ilvl="5" w:tplc="04070005" w:tentative="1">
+      <w:start w:val="1"/>
+      <w:numFmt w:val="bullet"/>
+      <w:lvlText w:val=""/>
+      <w:lvlJc w:val="left"/>
+      <w:pPr>
+        <w:ind w:left="4320" w:hanging="360"/>
+      </w:pPr>
+      <w:rPr>
+        <w:rFonts w:ascii="Wingdings" w:hAnsi="Wingdings" w:hint="default"/>
+      </w:rPr>
+    </w:lvl>
+    <w:lvl w:ilvl="6" w:tplc="04070001" w:tentative="1">
+      <w:start w:val="1"/>
+      <w:numFmt w:val="bullet"/>
+      <w:lvlText w:val=""/>
+      <w:lvlJc w:val="left"/>
+      <w:pPr>
+        <w:ind w:left="5040" w:hanging="360"/>
+      </w:pPr>
+      <w:rPr>
+        <w:rFonts w:ascii="Symbol" w:hAnsi="Symbol" w:hint="default"/>
+      </w:rPr>
+    </w:lvl>
+    <w:lvl w:ilvl="7" w:tplc="04070003" w:tentative="1">
+      <w:start w:val="1"/>
+      <w:numFmt w:val="bullet"/>
+      <w:lvlText w:val="o"/>
+      <w:lvlJc w:val="left"/>
+      <w:pPr>
+        <w:ind w:left="5760" w:hanging="360"/>
+      </w:pPr>
+      <w:rPr>
+        <w:rFonts w:ascii="Courier New" w:hAnsi="Courier New" w:cs="Courier New" w:hint="default"/>
+      </w:rPr>
+    </w:lvl>
+    <w:lvl w:ilvl="8" w:tplc="04070005" w:tentative="1">
+      <w:start w:val="1"/>
+      <w:numFmt w:val="bullet"/>
+      <w:lvlText w:val=""/>
+      <w:lvlJc w:val="left"/>
+      <w:pPr>
         <w:ind w:left="6480" w:hanging="360"/>
       </w:pPr>
       <w:rPr>
@@ -2320,6 +3077,9 @@
     </w:lvl>
   </w:abstractNum>
   <w:num w:numId="1">
+    <w:abstractNumId w:val="1"/>
+  </w:num>
+  <w:num w:numId="2">
     <w:abstractNumId w:val="0"/>
   </w:num>
 </w:numbering>

</xml_diff>